<commit_message>
did an expirment with wifi
</commit_message>
<xml_diff>
--- a/הצעת פרוייקט מעודכנת לפי קריטריונים.docx
+++ b/הצעת פרוייקט מעודכנת לפי קריטריונים.docx
@@ -1,6 +1,6 @@
 
 <file path=word/document.xml><?xml version="1.0" encoding="utf-8"?>
-<w:document xmlns:wpc="http://schemas.microsoft.com/office/word/2010/wordprocessingCanvas" xmlns:cx="http://schemas.microsoft.com/office/drawing/2014/chartex" xmlns:cx1="http://schemas.microsoft.com/office/drawing/2015/9/8/chartex" xmlns:cx2="http://schemas.microsoft.com/office/drawing/2015/10/21/chartex" xmlns:cx3="http://schemas.microsoft.com/office/drawing/2016/5/9/chartex" xmlns:cx4="http://schemas.microsoft.com/office/drawing/2016/5/10/chartex" xmlns:cx5="http://schemas.microsoft.com/office/drawing/2016/5/11/chartex" xmlns:cx6="http://schemas.microsoft.com/office/drawing/2016/5/12/chartex" xmlns:cx7="http://schemas.microsoft.com/office/drawing/2016/5/13/chartex" xmlns:cx8="http://schemas.microsoft.com/office/drawing/2016/5/14/chartex" xmlns:mc="http://schemas.openxmlformats.org/markup-compatibility/2006" xmlns:aink="http://schemas.microsoft.com/office/drawing/2016/ink" xmlns:am3d="http://schemas.microsoft.com/office/drawing/2017/model3d" xmlns:o="urn:schemas-microsoft-com:office:office" xmlns:oel="http://schemas.microsoft.com/office/2019/extlst" xmlns:r="http://schemas.openxmlformats.org/officeDocument/2006/relationships" xmlns:m="http://schemas.openxmlformats.org/officeDocument/2006/math" xmlns:v="urn:schemas-microsoft-com:vml" xmlns:wp14="http://schemas.microsoft.com/office/word/2010/wordprocessingDrawing" xmlns:wp="http://schemas.openxmlformats.org/drawingml/2006/wordprocessingDrawing" xmlns:w10="urn:schemas-microsoft-com:office:word" xmlns:w="http://schemas.openxmlformats.org/wordprocessingml/2006/main" xmlns:w14="http://schemas.microsoft.com/office/word/2010/wordml" xmlns:w15="http://schemas.microsoft.com/office/word/2012/wordml" xmlns:w16cex="http://schemas.microsoft.com/office/word/2018/wordml/cex" xmlns:w16cid="http://schemas.microsoft.com/office/word/2016/wordml/cid" xmlns:w16="http://schemas.microsoft.com/office/word/2018/wordml" xmlns:w16du="http://schemas.microsoft.com/office/word/2023/wordml/word16du" xmlns:w16sdtdh="http://schemas.microsoft.com/office/word/2020/wordml/sdtdatahash" xmlns:w16se="http://schemas.microsoft.com/office/word/2015/wordml/symex" xmlns:wpg="http://schemas.microsoft.com/office/word/2010/wordprocessingGroup" xmlns:wpi="http://schemas.microsoft.com/office/word/2010/wordprocessingInk" xmlns:wne="http://schemas.microsoft.com/office/word/2006/wordml" xmlns:wps="http://schemas.microsoft.com/office/word/2010/wordprocessingShape" mc:Ignorable="w14 w15 w16se w16cid w16 w16cex w16sdtdh w16du wp14">
+<w:document xmlns:wpc="http://schemas.microsoft.com/office/word/2010/wordprocessingCanvas" xmlns:cx="http://schemas.microsoft.com/office/drawing/2014/chartex" xmlns:cx1="http://schemas.microsoft.com/office/drawing/2015/9/8/chartex" xmlns:cx2="http://schemas.microsoft.com/office/drawing/2015/10/21/chartex" xmlns:cx3="http://schemas.microsoft.com/office/drawing/2016/5/9/chartex" xmlns:cx4="http://schemas.microsoft.com/office/drawing/2016/5/10/chartex" xmlns:cx5="http://schemas.microsoft.com/office/drawing/2016/5/11/chartex" xmlns:cx6="http://schemas.microsoft.com/office/drawing/2016/5/12/chartex" xmlns:cx7="http://schemas.microsoft.com/office/drawing/2016/5/13/chartex" xmlns:cx8="http://schemas.microsoft.com/office/drawing/2016/5/14/chartex" xmlns:mc="http://schemas.openxmlformats.org/markup-compatibility/2006" xmlns:aink="http://schemas.microsoft.com/office/drawing/2016/ink" xmlns:am3d="http://schemas.microsoft.com/office/drawing/2017/model3d" xmlns:o="urn:schemas-microsoft-com:office:office" xmlns:r="http://schemas.openxmlformats.org/officeDocument/2006/relationships" xmlns:m="http://schemas.openxmlformats.org/officeDocument/2006/math" xmlns:v="urn:schemas-microsoft-com:vml" xmlns:wp14="http://schemas.microsoft.com/office/word/2010/wordprocessingDrawing" xmlns:wp="http://schemas.openxmlformats.org/drawingml/2006/wordprocessingDrawing" xmlns:w10="urn:schemas-microsoft-com:office:word" xmlns:w="http://schemas.openxmlformats.org/wordprocessingml/2006/main" xmlns:w14="http://schemas.microsoft.com/office/word/2010/wordml" xmlns:w15="http://schemas.microsoft.com/office/word/2012/wordml" xmlns:w16cid="http://schemas.microsoft.com/office/word/2016/wordml/cid" xmlns:w16se="http://schemas.microsoft.com/office/word/2015/wordml/symex" xmlns:wpg="http://schemas.microsoft.com/office/word/2010/wordprocessingGroup" xmlns:wpi="http://schemas.microsoft.com/office/word/2010/wordprocessingInk" xmlns:wne="http://schemas.microsoft.com/office/word/2006/wordml" xmlns:wps="http://schemas.microsoft.com/office/word/2010/wordprocessingShape" mc:Ignorable="w14 w15 w16se w16cid wp14">
   <w:body>
     <w:p>
       <w:pPr>
@@ -259,10 +259,58 @@
         </w:rPr>
         <w:t xml:space="preserve"> </w:t>
       </w:r>
+      <w:r>
+        <w:rPr>
+          <w:rFonts w:hint="cs"/>
+          <w:rtl/>
+        </w:rPr>
+        <w:t>אלכסנדרה</w:t>
+      </w:r>
+      <w:r>
+        <w:rPr>
+          <w:rtl/>
+        </w:rPr>
+        <w:t xml:space="preserve"> </w:t>
+      </w:r>
+      <w:proofErr w:type="spellStart"/>
+      <w:r>
+        <w:rPr>
+          <w:rFonts w:cs="Arial" w:hint="cs"/>
+          <w:rtl/>
+        </w:rPr>
+        <w:t>ילרינובה</w:t>
+      </w:r>
+      <w:proofErr w:type="spellEnd"/>
+      <w:r>
+        <w:rPr>
+          <w:rFonts w:cs="Arial" w:hint="cs"/>
+          <w:rtl/>
+        </w:rPr>
+        <w:t xml:space="preserve"> </w:t>
+      </w:r>
+      <w:r>
+        <w:rPr>
+          <w:rtl/>
+        </w:rPr>
+        <w:t xml:space="preserve">- </w:t>
+      </w:r>
+      <w:r>
+        <w:rPr>
+          <w:rFonts w:cs="Arial" w:hint="cs"/>
+          <w:rtl/>
+        </w:rPr>
+        <w:t>342588837</w:t>
+      </w:r>
+      <w:r>
+        <w:rPr>
+          <w:rFonts w:cs="Arial"/>
+          <w:rtl/>
+        </w:rPr>
+        <w:t xml:space="preserve"> </w:t>
+      </w:r>
     </w:p>
     <w:p>
       <w:pPr>
-        <w:jc w:val="center"/>
         <w:rPr>
           <w:b/>
           <w:bCs/>
@@ -273,58 +321,9 @@
           <w:rtl/>
         </w:rPr>
       </w:pPr>
-      <w:r>
-        <w:rPr>
-          <w:rFonts w:hint="cs"/>
-          <w:rtl/>
-        </w:rPr>
-        <w:t>אלכסנדרה</w:t>
-      </w:r>
-      <w:r>
-        <w:rPr>
-          <w:rtl/>
-        </w:rPr>
-        <w:t xml:space="preserve"> </w:t>
-      </w:r>
-      <w:proofErr w:type="spellStart"/>
-      <w:r>
-        <w:rPr>
-          <w:rFonts w:cs="Arial" w:hint="cs"/>
-          <w:rtl/>
-        </w:rPr>
-        <w:t>ילרינובה</w:t>
-      </w:r>
-      <w:proofErr w:type="spellEnd"/>
-      <w:r>
-        <w:rPr>
-          <w:rFonts w:cs="Arial" w:hint="cs"/>
-          <w:rtl/>
-        </w:rPr>
-        <w:t xml:space="preserve"> </w:t>
-      </w:r>
-      <w:r>
-        <w:rPr>
-          <w:rtl/>
-        </w:rPr>
-        <w:t xml:space="preserve">- </w:t>
-      </w:r>
-      <w:r>
-        <w:rPr>
-          <w:rFonts w:cs="Arial" w:hint="cs"/>
-          <w:rtl/>
-        </w:rPr>
-        <w:t>342588837</w:t>
-      </w:r>
-      <w:r>
-        <w:rPr>
-          <w:rFonts w:cs="Arial"/>
-          <w:rtl/>
-        </w:rPr>
-        <w:t xml:space="preserve"> </w:t>
-      </w:r>
-    </w:p>
-    <w:p>
-      <w:pPr>
+      <w:bookmarkStart w:id="2" w:name="_GoBack"/>
+      <w:bookmarkEnd w:id="2"/>
+      <w:r>
         <w:rPr>
           <w:b/>
           <w:bCs/>
@@ -334,30 +333,19 @@
           <w:szCs w:val="96"/>
           <w:rtl/>
         </w:rPr>
-      </w:pPr>
-      <w:r>
-        <w:rPr>
+        <w:br w:type="page"/>
+      </w:r>
+    </w:p>
+    <w:p>
+      <w:pPr>
+        <w:rPr>
+          <w:rFonts w:cs="Arial"/>
           <w:b/>
           <w:bCs/>
-          <w:i/>
-          <w:iCs/>
-          <w:sz w:val="96"/>
-          <w:szCs w:val="96"/>
-          <w:rtl/>
-        </w:rPr>
-        <w:br w:type="page"/>
-      </w:r>
-    </w:p>
-    <w:p>
-      <w:pPr>
-        <w:rPr>
-          <w:rFonts w:cs="Arial"/>
-          <w:b/>
-          <w:bCs/>
-          <w:rtl/>
-        </w:rPr>
-      </w:pPr>
-      <w:bookmarkStart w:id="2" w:name="_Toc182945980"/>
+          <w:rtl/>
+        </w:rPr>
+      </w:pPr>
+      <w:bookmarkStart w:id="3" w:name="_Toc182945980"/>
       <w:r>
         <w:rPr>
           <w:rFonts w:cs="Arial"/>
@@ -869,7 +857,7 @@
       </w:r>
       <w:bookmarkEnd w:id="0"/>
       <w:bookmarkEnd w:id="1"/>
-      <w:bookmarkEnd w:id="2"/>
+      <w:bookmarkEnd w:id="3"/>
     </w:p>
     <w:p>
       <w:pPr>
@@ -1373,7 +1361,7 @@
               </wp:inline>
             </w:drawing>
           </mc:Choice>
-          <mc:Fallback>
+          <mc:Fallback xmlns:w16sdtdh="http://schemas.microsoft.com/office/word/2020/wordml/sdtdatahash" xmlns:w16du="http://schemas.microsoft.com/office/word/2023/wordml/word16du" xmlns:w16="http://schemas.microsoft.com/office/word/2018/wordml" xmlns:w16cex="http://schemas.microsoft.com/office/word/2018/wordml/cex" xmlns:oel="http://schemas.microsoft.com/office/2019/extlst">
             <w:pict>
               <v:roundrect w14:anchorId="0CE75BEF" id="מלבן מעוגל 6" o:spid="_x0000_s1026" style="width:9.45pt;height:9.45pt;visibility:visible;mso-wrap-style:square;mso-left-percent:-10001;mso-top-percent:-10001;mso-position-horizontal:absolute;mso-position-horizontal-relative:char;mso-position-vertical:absolute;mso-position-vertical-relative:line;mso-left-percent:-10001;mso-top-percent:-10001;v-text-anchor:top" arcsize="10923f" o:gfxdata="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" fillcolor="#a8d08d">
                 <o:lock v:ext="edit" aspectratio="t"/>
@@ -1509,7 +1497,7 @@
               </wp:inline>
             </w:drawing>
           </mc:Choice>
-          <mc:Fallback>
+          <mc:Fallback xmlns:w16sdtdh="http://schemas.microsoft.com/office/word/2020/wordml/sdtdatahash" xmlns:w16du="http://schemas.microsoft.com/office/word/2023/wordml/word16du" xmlns:w16="http://schemas.microsoft.com/office/word/2018/wordml" xmlns:w16cex="http://schemas.microsoft.com/office/word/2018/wordml/cex" xmlns:oel="http://schemas.microsoft.com/office/2019/extlst">
             <w:pict>
               <v:roundrect w14:anchorId="2E8A3E22" id="מלבן מעוגל 5" o:spid="_x0000_s1026" style="width:9.45pt;height:9.45pt;visibility:visible;mso-wrap-style:square;mso-left-percent:-10001;mso-top-percent:-10001;mso-position-horizontal:absolute;mso-position-horizontal-relative:char;mso-position-vertical:absolute;mso-position-vertical-relative:line;mso-left-percent:-10001;mso-top-percent:-10001;v-text-anchor:top" arcsize="10923f" o:gfxdata="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">
                 <o:lock v:ext="edit" aspectratio="t"/>
@@ -5148,7 +5136,7 @@
               </wp:inline>
             </w:drawing>
           </mc:Choice>
-          <mc:Fallback>
+          <mc:Fallback xmlns:w16sdtdh="http://schemas.microsoft.com/office/word/2020/wordml/sdtdatahash" xmlns:w16du="http://schemas.microsoft.com/office/word/2023/wordml/word16du" xmlns:w16="http://schemas.microsoft.com/office/word/2018/wordml" xmlns:w16cex="http://schemas.microsoft.com/office/word/2018/wordml/cex" xmlns:oel="http://schemas.microsoft.com/office/2019/extlst">
             <w:pict>
               <v:roundrect w14:anchorId="21F37253" id="מלבן מעוגל 4" o:spid="_x0000_s1026" style="width:9.45pt;height:9.45pt;visibility:visible;mso-wrap-style:square;mso-left-percent:-10001;mso-top-percent:-10001;mso-position-horizontal:absolute;mso-position-horizontal-relative:char;mso-position-vertical:absolute;mso-position-vertical-relative:line;mso-left-percent:-10001;mso-top-percent:-10001;v-text-anchor:top" arcsize="10923f" o:gfxdata="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">
                 <o:lock v:ext="edit" aspectratio="t"/>
@@ -5235,7 +5223,7 @@
               </wp:inline>
             </w:drawing>
           </mc:Choice>
-          <mc:Fallback>
+          <mc:Fallback xmlns:w16sdtdh="http://schemas.microsoft.com/office/word/2020/wordml/sdtdatahash" xmlns:w16du="http://schemas.microsoft.com/office/word/2023/wordml/word16du" xmlns:w16="http://schemas.microsoft.com/office/word/2018/wordml" xmlns:w16cex="http://schemas.microsoft.com/office/word/2018/wordml/cex" xmlns:oel="http://schemas.microsoft.com/office/2019/extlst">
             <w:pict>
               <v:roundrect w14:anchorId="52FCA988" id="מלבן מעוגל 3" o:spid="_x0000_s1026" style="width:9.45pt;height:9.45pt;visibility:visible;mso-wrap-style:square;mso-left-percent:-10001;mso-top-percent:-10001;mso-position-horizontal:absolute;mso-position-horizontal-relative:char;mso-position-vertical:absolute;mso-position-vertical-relative:line;mso-left-percent:-10001;mso-top-percent:-10001;v-text-anchor:top" arcsize="10923f" o:gfxdata="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">
                 <o:lock v:ext="edit" aspectratio="t"/>
@@ -5368,7 +5356,7 @@
               </wp:inline>
             </w:drawing>
           </mc:Choice>
-          <mc:Fallback>
+          <mc:Fallback xmlns:w16sdtdh="http://schemas.microsoft.com/office/word/2020/wordml/sdtdatahash" xmlns:w16du="http://schemas.microsoft.com/office/word/2023/wordml/word16du" xmlns:w16="http://schemas.microsoft.com/office/word/2018/wordml" xmlns:w16cex="http://schemas.microsoft.com/office/word/2018/wordml/cex" xmlns:oel="http://schemas.microsoft.com/office/2019/extlst">
             <w:pict>
               <v:roundrect w14:anchorId="530D963E" id="מלבן מעוגל 2" o:spid="_x0000_s1026" style="width:9.45pt;height:9.45pt;visibility:visible;mso-wrap-style:square;mso-left-percent:-10001;mso-top-percent:-10001;mso-position-horizontal:absolute;mso-position-horizontal-relative:char;mso-position-vertical:absolute;mso-position-vertical-relative:line;mso-left-percent:-10001;mso-top-percent:-10001;v-text-anchor:top" arcsize="10923f" o:gfxdata="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">
                 <o:lock v:ext="edit" aspectratio="t"/>
@@ -5517,7 +5505,7 @@
               </wp:inline>
             </w:drawing>
           </mc:Choice>
-          <mc:Fallback>
+          <mc:Fallback xmlns:w16sdtdh="http://schemas.microsoft.com/office/word/2020/wordml/sdtdatahash" xmlns:w16du="http://schemas.microsoft.com/office/word/2023/wordml/word16du" xmlns:w16="http://schemas.microsoft.com/office/word/2018/wordml" xmlns:w16cex="http://schemas.microsoft.com/office/word/2018/wordml/cex" xmlns:oel="http://schemas.microsoft.com/office/2019/extlst">
             <w:pict>
               <v:roundrect w14:anchorId="2FA73AF1" id="מלבן מעוגל 1" o:spid="_x0000_s1026" style="width:9.45pt;height:9.45pt;visibility:visible;mso-wrap-style:square;mso-left-percent:-10001;mso-top-percent:-10001;mso-position-horizontal:absolute;mso-position-horizontal-relative:char;mso-position-vertical:absolute;mso-position-vertical-relative:line;mso-left-percent:-10001;mso-top-percent:-10001;v-text-anchor:top" arcsize="10923f" o:gfxdata="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">
                 <o:lock v:ext="edit" aspectratio="t"/>
@@ -6200,7 +6188,7 @@
 </file>
 
 <file path=word/endnotes.xml><?xml version="1.0" encoding="utf-8"?>
-<w:endnotes xmlns:wpc="http://schemas.microsoft.com/office/word/2010/wordprocessingCanvas" xmlns:cx="http://schemas.microsoft.com/office/drawing/2014/chartex" xmlns:cx1="http://schemas.microsoft.com/office/drawing/2015/9/8/chartex" xmlns:cx2="http://schemas.microsoft.com/office/drawing/2015/10/21/chartex" xmlns:cx3="http://schemas.microsoft.com/office/drawing/2016/5/9/chartex" xmlns:cx4="http://schemas.microsoft.com/office/drawing/2016/5/10/chartex" xmlns:cx5="http://schemas.microsoft.com/office/drawing/2016/5/11/chartex" xmlns:cx6="http://schemas.microsoft.com/office/drawing/2016/5/12/chartex" xmlns:cx7="http://schemas.microsoft.com/office/drawing/2016/5/13/chartex" xmlns:cx8="http://schemas.microsoft.com/office/drawing/2016/5/14/chartex" xmlns:mc="http://schemas.openxmlformats.org/markup-compatibility/2006" xmlns:aink="http://schemas.microsoft.com/office/drawing/2016/ink" xmlns:am3d="http://schemas.microsoft.com/office/drawing/2017/model3d" xmlns:o="urn:schemas-microsoft-com:office:office" xmlns:oel="http://schemas.microsoft.com/office/2019/extlst" xmlns:r="http://schemas.openxmlformats.org/officeDocument/2006/relationships" xmlns:m="http://schemas.openxmlformats.org/officeDocument/2006/math" xmlns:v="urn:schemas-microsoft-com:vml" xmlns:wp14="http://schemas.microsoft.com/office/word/2010/wordprocessingDrawing" xmlns:wp="http://schemas.openxmlformats.org/drawingml/2006/wordprocessingDrawing" xmlns:w10="urn:schemas-microsoft-com:office:word" xmlns:w="http://schemas.openxmlformats.org/wordprocessingml/2006/main" xmlns:w14="http://schemas.microsoft.com/office/word/2010/wordml" xmlns:w15="http://schemas.microsoft.com/office/word/2012/wordml" xmlns:w16cex="http://schemas.microsoft.com/office/word/2018/wordml/cex" xmlns:w16cid="http://schemas.microsoft.com/office/word/2016/wordml/cid" xmlns:w16="http://schemas.microsoft.com/office/word/2018/wordml" xmlns:w16du="http://schemas.microsoft.com/office/word/2023/wordml/word16du" xmlns:w16sdtdh="http://schemas.microsoft.com/office/word/2020/wordml/sdtdatahash" xmlns:w16se="http://schemas.microsoft.com/office/word/2015/wordml/symex" xmlns:wpg="http://schemas.microsoft.com/office/word/2010/wordprocessingGroup" xmlns:wpi="http://schemas.microsoft.com/office/word/2010/wordprocessingInk" xmlns:wne="http://schemas.microsoft.com/office/word/2006/wordml" xmlns:wps="http://schemas.microsoft.com/office/word/2010/wordprocessingShape" mc:Ignorable="w14 w15 w16se w16cid w16 w16cex w16sdtdh w16du wp14">
+<w:endnotes xmlns:wpc="http://schemas.microsoft.com/office/word/2010/wordprocessingCanvas" xmlns:cx="http://schemas.microsoft.com/office/drawing/2014/chartex" xmlns:cx1="http://schemas.microsoft.com/office/drawing/2015/9/8/chartex" xmlns:cx2="http://schemas.microsoft.com/office/drawing/2015/10/21/chartex" xmlns:cx3="http://schemas.microsoft.com/office/drawing/2016/5/9/chartex" xmlns:cx4="http://schemas.microsoft.com/office/drawing/2016/5/10/chartex" xmlns:cx5="http://schemas.microsoft.com/office/drawing/2016/5/11/chartex" xmlns:cx6="http://schemas.microsoft.com/office/drawing/2016/5/12/chartex" xmlns:cx7="http://schemas.microsoft.com/office/drawing/2016/5/13/chartex" xmlns:cx8="http://schemas.microsoft.com/office/drawing/2016/5/14/chartex" xmlns:mc="http://schemas.openxmlformats.org/markup-compatibility/2006" xmlns:aink="http://schemas.microsoft.com/office/drawing/2016/ink" xmlns:am3d="http://schemas.microsoft.com/office/drawing/2017/model3d" xmlns:o="urn:schemas-microsoft-com:office:office" xmlns:r="http://schemas.openxmlformats.org/officeDocument/2006/relationships" xmlns:m="http://schemas.openxmlformats.org/officeDocument/2006/math" xmlns:v="urn:schemas-microsoft-com:vml" xmlns:wp14="http://schemas.microsoft.com/office/word/2010/wordprocessingDrawing" xmlns:wp="http://schemas.openxmlformats.org/drawingml/2006/wordprocessingDrawing" xmlns:w10="urn:schemas-microsoft-com:office:word" xmlns:w="http://schemas.openxmlformats.org/wordprocessingml/2006/main" xmlns:w14="http://schemas.microsoft.com/office/word/2010/wordml" xmlns:w15="http://schemas.microsoft.com/office/word/2012/wordml" xmlns:w16cid="http://schemas.microsoft.com/office/word/2016/wordml/cid" xmlns:w16se="http://schemas.microsoft.com/office/word/2015/wordml/symex" xmlns:wpg="http://schemas.microsoft.com/office/word/2010/wordprocessingGroup" xmlns:wpi="http://schemas.microsoft.com/office/word/2010/wordprocessingInk" xmlns:wne="http://schemas.microsoft.com/office/word/2006/wordml" xmlns:wps="http://schemas.microsoft.com/office/word/2010/wordprocessingShape" mc:Ignorable="w14 w15 w16se w16cid wp14">
   <w:endnote w:type="separator" w:id="-1">
     <w:p>
       <w:pPr>
@@ -6225,7 +6213,7 @@
 </file>
 
 <file path=word/footer1.xml><?xml version="1.0" encoding="utf-8"?>
-<w:ftr xmlns:wpc="http://schemas.microsoft.com/office/word/2010/wordprocessingCanvas" xmlns:cx="http://schemas.microsoft.com/office/drawing/2014/chartex" xmlns:cx1="http://schemas.microsoft.com/office/drawing/2015/9/8/chartex" xmlns:cx2="http://schemas.microsoft.com/office/drawing/2015/10/21/chartex" xmlns:cx3="http://schemas.microsoft.com/office/drawing/2016/5/9/chartex" xmlns:cx4="http://schemas.microsoft.com/office/drawing/2016/5/10/chartex" xmlns:cx5="http://schemas.microsoft.com/office/drawing/2016/5/11/chartex" xmlns:cx6="http://schemas.microsoft.com/office/drawing/2016/5/12/chartex" xmlns:cx7="http://schemas.microsoft.com/office/drawing/2016/5/13/chartex" xmlns:cx8="http://schemas.microsoft.com/office/drawing/2016/5/14/chartex" xmlns:mc="http://schemas.openxmlformats.org/markup-compatibility/2006" xmlns:aink="http://schemas.microsoft.com/office/drawing/2016/ink" xmlns:am3d="http://schemas.microsoft.com/office/drawing/2017/model3d" xmlns:o="urn:schemas-microsoft-com:office:office" xmlns:oel="http://schemas.microsoft.com/office/2019/extlst" xmlns:r="http://schemas.openxmlformats.org/officeDocument/2006/relationships" xmlns:m="http://schemas.openxmlformats.org/officeDocument/2006/math" xmlns:v="urn:schemas-microsoft-com:vml" xmlns:wp14="http://schemas.microsoft.com/office/word/2010/wordprocessingDrawing" xmlns:wp="http://schemas.openxmlformats.org/drawingml/2006/wordprocessingDrawing" xmlns:w10="urn:schemas-microsoft-com:office:word" xmlns:w="http://schemas.openxmlformats.org/wordprocessingml/2006/main" xmlns:w14="http://schemas.microsoft.com/office/word/2010/wordml" xmlns:w15="http://schemas.microsoft.com/office/word/2012/wordml" xmlns:w16cex="http://schemas.microsoft.com/office/word/2018/wordml/cex" xmlns:w16cid="http://schemas.microsoft.com/office/word/2016/wordml/cid" xmlns:w16="http://schemas.microsoft.com/office/word/2018/wordml" xmlns:w16du="http://schemas.microsoft.com/office/word/2023/wordml/word16du" xmlns:w16sdtdh="http://schemas.microsoft.com/office/word/2020/wordml/sdtdatahash" xmlns:w16se="http://schemas.microsoft.com/office/word/2015/wordml/symex" xmlns:wpg="http://schemas.microsoft.com/office/word/2010/wordprocessingGroup" xmlns:wpi="http://schemas.microsoft.com/office/word/2010/wordprocessingInk" xmlns:wne="http://schemas.microsoft.com/office/word/2006/wordml" xmlns:wps="http://schemas.microsoft.com/office/word/2010/wordprocessingShape" mc:Ignorable="w14 w15 w16se w16cid w16 w16cex w16sdtdh w16du wp14">
+<w:ftr xmlns:wpc="http://schemas.microsoft.com/office/word/2010/wordprocessingCanvas" xmlns:cx="http://schemas.microsoft.com/office/drawing/2014/chartex" xmlns:cx1="http://schemas.microsoft.com/office/drawing/2015/9/8/chartex" xmlns:cx2="http://schemas.microsoft.com/office/drawing/2015/10/21/chartex" xmlns:cx3="http://schemas.microsoft.com/office/drawing/2016/5/9/chartex" xmlns:cx4="http://schemas.microsoft.com/office/drawing/2016/5/10/chartex" xmlns:cx5="http://schemas.microsoft.com/office/drawing/2016/5/11/chartex" xmlns:cx6="http://schemas.microsoft.com/office/drawing/2016/5/12/chartex" xmlns:cx7="http://schemas.microsoft.com/office/drawing/2016/5/13/chartex" xmlns:cx8="http://schemas.microsoft.com/office/drawing/2016/5/14/chartex" xmlns:mc="http://schemas.openxmlformats.org/markup-compatibility/2006" xmlns:aink="http://schemas.microsoft.com/office/drawing/2016/ink" xmlns:am3d="http://schemas.microsoft.com/office/drawing/2017/model3d" xmlns:o="urn:schemas-microsoft-com:office:office" xmlns:r="http://schemas.openxmlformats.org/officeDocument/2006/relationships" xmlns:m="http://schemas.openxmlformats.org/officeDocument/2006/math" xmlns:v="urn:schemas-microsoft-com:vml" xmlns:wp14="http://schemas.microsoft.com/office/word/2010/wordprocessingDrawing" xmlns:wp="http://schemas.openxmlformats.org/drawingml/2006/wordprocessingDrawing" xmlns:w10="urn:schemas-microsoft-com:office:word" xmlns:w="http://schemas.openxmlformats.org/wordprocessingml/2006/main" xmlns:w14="http://schemas.microsoft.com/office/word/2010/wordml" xmlns:w15="http://schemas.microsoft.com/office/word/2012/wordml" xmlns:w16cid="http://schemas.microsoft.com/office/word/2016/wordml/cid" xmlns:w16se="http://schemas.microsoft.com/office/word/2015/wordml/symex" xmlns:wpg="http://schemas.microsoft.com/office/word/2010/wordprocessingGroup" xmlns:wpi="http://schemas.microsoft.com/office/word/2010/wordprocessingInk" xmlns:wne="http://schemas.microsoft.com/office/word/2006/wordml" xmlns:wps="http://schemas.microsoft.com/office/word/2010/wordprocessingShape" mc:Ignorable="w14 w15 w16se w16cid wp14">
   <w:sdt>
     <w:sdtPr>
       <w:rPr>
@@ -6237,6 +6225,7 @@
         <w:docPartUnique/>
       </w:docPartObj>
     </w:sdtPr>
+    <w:sdtEndPr/>
     <w:sdtContent>
       <w:p>
         <w:pPr>
@@ -6274,7 +6263,7 @@
 </file>
 
 <file path=word/footnotes.xml><?xml version="1.0" encoding="utf-8"?>
-<w:footnotes xmlns:wpc="http://schemas.microsoft.com/office/word/2010/wordprocessingCanvas" xmlns:cx="http://schemas.microsoft.com/office/drawing/2014/chartex" xmlns:cx1="http://schemas.microsoft.com/office/drawing/2015/9/8/chartex" xmlns:cx2="http://schemas.microsoft.com/office/drawing/2015/10/21/chartex" xmlns:cx3="http://schemas.microsoft.com/office/drawing/2016/5/9/chartex" xmlns:cx4="http://schemas.microsoft.com/office/drawing/2016/5/10/chartex" xmlns:cx5="http://schemas.microsoft.com/office/drawing/2016/5/11/chartex" xmlns:cx6="http://schemas.microsoft.com/office/drawing/2016/5/12/chartex" xmlns:cx7="http://schemas.microsoft.com/office/drawing/2016/5/13/chartex" xmlns:cx8="http://schemas.microsoft.com/office/drawing/2016/5/14/chartex" xmlns:mc="http://schemas.openxmlformats.org/markup-compatibility/2006" xmlns:aink="http://schemas.microsoft.com/office/drawing/2016/ink" xmlns:am3d="http://schemas.microsoft.com/office/drawing/2017/model3d" xmlns:o="urn:schemas-microsoft-com:office:office" xmlns:oel="http://schemas.microsoft.com/office/2019/extlst" xmlns:r="http://schemas.openxmlformats.org/officeDocument/2006/relationships" xmlns:m="http://schemas.openxmlformats.org/officeDocument/2006/math" xmlns:v="urn:schemas-microsoft-com:vml" xmlns:wp14="http://schemas.microsoft.com/office/word/2010/wordprocessingDrawing" xmlns:wp="http://schemas.openxmlformats.org/drawingml/2006/wordprocessingDrawing" xmlns:w10="urn:schemas-microsoft-com:office:word" xmlns:w="http://schemas.openxmlformats.org/wordprocessingml/2006/main" xmlns:w14="http://schemas.microsoft.com/office/word/2010/wordml" xmlns:w15="http://schemas.microsoft.com/office/word/2012/wordml" xmlns:w16cex="http://schemas.microsoft.com/office/word/2018/wordml/cex" xmlns:w16cid="http://schemas.microsoft.com/office/word/2016/wordml/cid" xmlns:w16="http://schemas.microsoft.com/office/word/2018/wordml" xmlns:w16du="http://schemas.microsoft.com/office/word/2023/wordml/word16du" xmlns:w16sdtdh="http://schemas.microsoft.com/office/word/2020/wordml/sdtdatahash" xmlns:w16se="http://schemas.microsoft.com/office/word/2015/wordml/symex" xmlns:wpg="http://schemas.microsoft.com/office/word/2010/wordprocessingGroup" xmlns:wpi="http://schemas.microsoft.com/office/word/2010/wordprocessingInk" xmlns:wne="http://schemas.microsoft.com/office/word/2006/wordml" xmlns:wps="http://schemas.microsoft.com/office/word/2010/wordprocessingShape" mc:Ignorable="w14 w15 w16se w16cid w16 w16cex w16sdtdh w16du wp14">
+<w:footnotes xmlns:wpc="http://schemas.microsoft.com/office/word/2010/wordprocessingCanvas" xmlns:cx="http://schemas.microsoft.com/office/drawing/2014/chartex" xmlns:cx1="http://schemas.microsoft.com/office/drawing/2015/9/8/chartex" xmlns:cx2="http://schemas.microsoft.com/office/drawing/2015/10/21/chartex" xmlns:cx3="http://schemas.microsoft.com/office/drawing/2016/5/9/chartex" xmlns:cx4="http://schemas.microsoft.com/office/drawing/2016/5/10/chartex" xmlns:cx5="http://schemas.microsoft.com/office/drawing/2016/5/11/chartex" xmlns:cx6="http://schemas.microsoft.com/office/drawing/2016/5/12/chartex" xmlns:cx7="http://schemas.microsoft.com/office/drawing/2016/5/13/chartex" xmlns:cx8="http://schemas.microsoft.com/office/drawing/2016/5/14/chartex" xmlns:mc="http://schemas.openxmlformats.org/markup-compatibility/2006" xmlns:aink="http://schemas.microsoft.com/office/drawing/2016/ink" xmlns:am3d="http://schemas.microsoft.com/office/drawing/2017/model3d" xmlns:o="urn:schemas-microsoft-com:office:office" xmlns:r="http://schemas.openxmlformats.org/officeDocument/2006/relationships" xmlns:m="http://schemas.openxmlformats.org/officeDocument/2006/math" xmlns:v="urn:schemas-microsoft-com:vml" xmlns:wp14="http://schemas.microsoft.com/office/word/2010/wordprocessingDrawing" xmlns:wp="http://schemas.openxmlformats.org/drawingml/2006/wordprocessingDrawing" xmlns:w10="urn:schemas-microsoft-com:office:word" xmlns:w="http://schemas.openxmlformats.org/wordprocessingml/2006/main" xmlns:w14="http://schemas.microsoft.com/office/word/2010/wordml" xmlns:w15="http://schemas.microsoft.com/office/word/2012/wordml" xmlns:w16cid="http://schemas.microsoft.com/office/word/2016/wordml/cid" xmlns:w16se="http://schemas.microsoft.com/office/word/2015/wordml/symex" xmlns:wpg="http://schemas.microsoft.com/office/word/2010/wordprocessingGroup" xmlns:wpi="http://schemas.microsoft.com/office/word/2010/wordprocessingInk" xmlns:wne="http://schemas.microsoft.com/office/word/2006/wordml" xmlns:wps="http://schemas.microsoft.com/office/word/2010/wordprocessingShape" mc:Ignorable="w14 w15 w16se w16cid wp14">
   <w:footnote w:type="separator" w:id="-1">
     <w:p>
       <w:pPr>
@@ -6299,7 +6288,7 @@
 </file>
 
 <file path=word/header1.xml><?xml version="1.0" encoding="utf-8"?>
-<w:hdr xmlns:wpc="http://schemas.microsoft.com/office/word/2010/wordprocessingCanvas" xmlns:cx="http://schemas.microsoft.com/office/drawing/2014/chartex" xmlns:cx1="http://schemas.microsoft.com/office/drawing/2015/9/8/chartex" xmlns:cx2="http://schemas.microsoft.com/office/drawing/2015/10/21/chartex" xmlns:cx3="http://schemas.microsoft.com/office/drawing/2016/5/9/chartex" xmlns:cx4="http://schemas.microsoft.com/office/drawing/2016/5/10/chartex" xmlns:cx5="http://schemas.microsoft.com/office/drawing/2016/5/11/chartex" xmlns:cx6="http://schemas.microsoft.com/office/drawing/2016/5/12/chartex" xmlns:cx7="http://schemas.microsoft.com/office/drawing/2016/5/13/chartex" xmlns:cx8="http://schemas.microsoft.com/office/drawing/2016/5/14/chartex" xmlns:mc="http://schemas.openxmlformats.org/markup-compatibility/2006" xmlns:aink="http://schemas.microsoft.com/office/drawing/2016/ink" xmlns:am3d="http://schemas.microsoft.com/office/drawing/2017/model3d" xmlns:o="urn:schemas-microsoft-com:office:office" xmlns:oel="http://schemas.microsoft.com/office/2019/extlst" xmlns:r="http://schemas.openxmlformats.org/officeDocument/2006/relationships" xmlns:m="http://schemas.openxmlformats.org/officeDocument/2006/math" xmlns:v="urn:schemas-microsoft-com:vml" xmlns:wp14="http://schemas.microsoft.com/office/word/2010/wordprocessingDrawing" xmlns:wp="http://schemas.openxmlformats.org/drawingml/2006/wordprocessingDrawing" xmlns:w10="urn:schemas-microsoft-com:office:word" xmlns:w="http://schemas.openxmlformats.org/wordprocessingml/2006/main" xmlns:w14="http://schemas.microsoft.com/office/word/2010/wordml" xmlns:w15="http://schemas.microsoft.com/office/word/2012/wordml" xmlns:w16cex="http://schemas.microsoft.com/office/word/2018/wordml/cex" xmlns:w16cid="http://schemas.microsoft.com/office/word/2016/wordml/cid" xmlns:w16="http://schemas.microsoft.com/office/word/2018/wordml" xmlns:w16du="http://schemas.microsoft.com/office/word/2023/wordml/word16du" xmlns:w16sdtdh="http://schemas.microsoft.com/office/word/2020/wordml/sdtdatahash" xmlns:w16se="http://schemas.microsoft.com/office/word/2015/wordml/symex" xmlns:wpg="http://schemas.microsoft.com/office/word/2010/wordprocessingGroup" xmlns:wpi="http://schemas.microsoft.com/office/word/2010/wordprocessingInk" xmlns:wne="http://schemas.microsoft.com/office/word/2006/wordml" xmlns:wps="http://schemas.microsoft.com/office/word/2010/wordprocessingShape" mc:Ignorable="w14 w15 w16se w16cid w16 w16cex w16sdtdh w16du wp14">
+<w:hdr xmlns:wpc="http://schemas.microsoft.com/office/word/2010/wordprocessingCanvas" xmlns:cx="http://schemas.microsoft.com/office/drawing/2014/chartex" xmlns:cx1="http://schemas.microsoft.com/office/drawing/2015/9/8/chartex" xmlns:cx2="http://schemas.microsoft.com/office/drawing/2015/10/21/chartex" xmlns:cx3="http://schemas.microsoft.com/office/drawing/2016/5/9/chartex" xmlns:cx4="http://schemas.microsoft.com/office/drawing/2016/5/10/chartex" xmlns:cx5="http://schemas.microsoft.com/office/drawing/2016/5/11/chartex" xmlns:cx6="http://schemas.microsoft.com/office/drawing/2016/5/12/chartex" xmlns:cx7="http://schemas.microsoft.com/office/drawing/2016/5/13/chartex" xmlns:cx8="http://schemas.microsoft.com/office/drawing/2016/5/14/chartex" xmlns:mc="http://schemas.openxmlformats.org/markup-compatibility/2006" xmlns:aink="http://schemas.microsoft.com/office/drawing/2016/ink" xmlns:am3d="http://schemas.microsoft.com/office/drawing/2017/model3d" xmlns:o="urn:schemas-microsoft-com:office:office" xmlns:r="http://schemas.openxmlformats.org/officeDocument/2006/relationships" xmlns:m="http://schemas.openxmlformats.org/officeDocument/2006/math" xmlns:v="urn:schemas-microsoft-com:vml" xmlns:wp14="http://schemas.microsoft.com/office/word/2010/wordprocessingDrawing" xmlns:wp="http://schemas.openxmlformats.org/drawingml/2006/wordprocessingDrawing" xmlns:w10="urn:schemas-microsoft-com:office:word" xmlns:w="http://schemas.openxmlformats.org/wordprocessingml/2006/main" xmlns:w14="http://schemas.microsoft.com/office/word/2010/wordml" xmlns:w15="http://schemas.microsoft.com/office/word/2012/wordml" xmlns:w16cid="http://schemas.microsoft.com/office/word/2016/wordml/cid" xmlns:w16se="http://schemas.microsoft.com/office/word/2015/wordml/symex" xmlns:wpg="http://schemas.microsoft.com/office/word/2010/wordprocessingGroup" xmlns:wpi="http://schemas.microsoft.com/office/word/2010/wordprocessingInk" xmlns:wne="http://schemas.microsoft.com/office/word/2006/wordml" xmlns:wps="http://schemas.microsoft.com/office/word/2010/wordprocessingShape" mc:Ignorable="w14 w15 w16se w16cid wp14">
   <w:p>
     <w:pPr>
       <w:pStyle w:val="af"/>
@@ -6369,7 +6358,7 @@
 </file>
 
 <file path=word/numbering.xml><?xml version="1.0" encoding="utf-8"?>
-<w:numbering xmlns:wpc="http://schemas.microsoft.com/office/word/2010/wordprocessingCanvas" xmlns:cx="http://schemas.microsoft.com/office/drawing/2014/chartex" xmlns:cx1="http://schemas.microsoft.com/office/drawing/2015/9/8/chartex" xmlns:cx2="http://schemas.microsoft.com/office/drawing/2015/10/21/chartex" xmlns:cx3="http://schemas.microsoft.com/office/drawing/2016/5/9/chartex" xmlns:cx4="http://schemas.microsoft.com/office/drawing/2016/5/10/chartex" xmlns:cx5="http://schemas.microsoft.com/office/drawing/2016/5/11/chartex" xmlns:cx6="http://schemas.microsoft.com/office/drawing/2016/5/12/chartex" xmlns:cx7="http://schemas.microsoft.com/office/drawing/2016/5/13/chartex" xmlns:cx8="http://schemas.microsoft.com/office/drawing/2016/5/14/chartex" xmlns:mc="http://schemas.openxmlformats.org/markup-compatibility/2006" xmlns:aink="http://schemas.microsoft.com/office/drawing/2016/ink" xmlns:am3d="http://schemas.microsoft.com/office/drawing/2017/model3d" xmlns:o="urn:schemas-microsoft-com:office:office" xmlns:oel="http://schemas.microsoft.com/office/2019/extlst" xmlns:r="http://schemas.openxmlformats.org/officeDocument/2006/relationships" xmlns:m="http://schemas.openxmlformats.org/officeDocument/2006/math" xmlns:v="urn:schemas-microsoft-com:vml" xmlns:wp14="http://schemas.microsoft.com/office/word/2010/wordprocessingDrawing" xmlns:wp="http://schemas.openxmlformats.org/drawingml/2006/wordprocessingDrawing" xmlns:w10="urn:schemas-microsoft-com:office:word" xmlns:w="http://schemas.openxmlformats.org/wordprocessingml/2006/main" xmlns:w14="http://schemas.microsoft.com/office/word/2010/wordml" xmlns:w15="http://schemas.microsoft.com/office/word/2012/wordml" xmlns:w16cex="http://schemas.microsoft.com/office/word/2018/wordml/cex" xmlns:w16cid="http://schemas.microsoft.com/office/word/2016/wordml/cid" xmlns:w16="http://schemas.microsoft.com/office/word/2018/wordml" xmlns:w16du="http://schemas.microsoft.com/office/word/2023/wordml/word16du" xmlns:w16sdtdh="http://schemas.microsoft.com/office/word/2020/wordml/sdtdatahash" xmlns:w16se="http://schemas.microsoft.com/office/word/2015/wordml/symex" xmlns:wpg="http://schemas.microsoft.com/office/word/2010/wordprocessingGroup" xmlns:wpi="http://schemas.microsoft.com/office/word/2010/wordprocessingInk" xmlns:wne="http://schemas.microsoft.com/office/word/2006/wordml" xmlns:wps="http://schemas.microsoft.com/office/word/2010/wordprocessingShape" mc:Ignorable="w14 w15 w16se w16cid w16 w16cex w16sdtdh w16du wp14">
+<w:numbering xmlns:wpc="http://schemas.microsoft.com/office/word/2010/wordprocessingCanvas" xmlns:cx="http://schemas.microsoft.com/office/drawing/2014/chartex" xmlns:cx1="http://schemas.microsoft.com/office/drawing/2015/9/8/chartex" xmlns:cx2="http://schemas.microsoft.com/office/drawing/2015/10/21/chartex" xmlns:cx3="http://schemas.microsoft.com/office/drawing/2016/5/9/chartex" xmlns:cx4="http://schemas.microsoft.com/office/drawing/2016/5/10/chartex" xmlns:cx5="http://schemas.microsoft.com/office/drawing/2016/5/11/chartex" xmlns:cx6="http://schemas.microsoft.com/office/drawing/2016/5/12/chartex" xmlns:cx7="http://schemas.microsoft.com/office/drawing/2016/5/13/chartex" xmlns:cx8="http://schemas.microsoft.com/office/drawing/2016/5/14/chartex" xmlns:mc="http://schemas.openxmlformats.org/markup-compatibility/2006" xmlns:aink="http://schemas.microsoft.com/office/drawing/2016/ink" xmlns:am3d="http://schemas.microsoft.com/office/drawing/2017/model3d" xmlns:o="urn:schemas-microsoft-com:office:office" xmlns:r="http://schemas.openxmlformats.org/officeDocument/2006/relationships" xmlns:m="http://schemas.openxmlformats.org/officeDocument/2006/math" xmlns:v="urn:schemas-microsoft-com:vml" xmlns:wp14="http://schemas.microsoft.com/office/word/2010/wordprocessingDrawing" xmlns:wp="http://schemas.openxmlformats.org/drawingml/2006/wordprocessingDrawing" xmlns:w10="urn:schemas-microsoft-com:office:word" xmlns:w="http://schemas.openxmlformats.org/wordprocessingml/2006/main" xmlns:w14="http://schemas.microsoft.com/office/word/2010/wordml" xmlns:w15="http://schemas.microsoft.com/office/word/2012/wordml" xmlns:w16cid="http://schemas.microsoft.com/office/word/2016/wordml/cid" xmlns:w16se="http://schemas.microsoft.com/office/word/2015/wordml/symex" xmlns:wpg="http://schemas.microsoft.com/office/word/2010/wordprocessingGroup" xmlns:wpi="http://schemas.microsoft.com/office/word/2010/wordprocessingInk" xmlns:wne="http://schemas.microsoft.com/office/word/2006/wordml" xmlns:wps="http://schemas.microsoft.com/office/word/2010/wordprocessingShape" mc:Ignorable="w14 w15 w16se w16cid wp14">
   <w:abstractNum w:abstractNumId="0" w15:restartNumberingAfterBreak="0">
     <w:nsid w:val="06E64581"/>
     <w:multiLevelType w:val="hybridMultilevel"/>
@@ -9381,77 +9370,77 @@
       </w:rPr>
     </w:lvl>
   </w:abstractNum>
-  <w:num w:numId="1" w16cid:durableId="1000037607">
+  <w:num w:numId="1">
     <w:abstractNumId w:val="8"/>
   </w:num>
-  <w:num w:numId="2" w16cid:durableId="566721241">
+  <w:num w:numId="2">
     <w:abstractNumId w:val="2"/>
   </w:num>
-  <w:num w:numId="3" w16cid:durableId="27293799">
+  <w:num w:numId="3">
     <w:abstractNumId w:val="12"/>
   </w:num>
-  <w:num w:numId="4" w16cid:durableId="1883246640">
+  <w:num w:numId="4">
     <w:abstractNumId w:val="3"/>
   </w:num>
-  <w:num w:numId="5" w16cid:durableId="1649481696">
+  <w:num w:numId="5">
     <w:abstractNumId w:val="13"/>
   </w:num>
-  <w:num w:numId="6" w16cid:durableId="355427558">
+  <w:num w:numId="6">
     <w:abstractNumId w:val="10"/>
   </w:num>
-  <w:num w:numId="7" w16cid:durableId="679166741">
+  <w:num w:numId="7">
     <w:abstractNumId w:val="9"/>
   </w:num>
-  <w:num w:numId="8" w16cid:durableId="1641182709">
+  <w:num w:numId="8">
     <w:abstractNumId w:val="11"/>
   </w:num>
-  <w:num w:numId="9" w16cid:durableId="200438154">
+  <w:num w:numId="9">
     <w:abstractNumId w:val="4"/>
   </w:num>
-  <w:num w:numId="10" w16cid:durableId="784466987">
+  <w:num w:numId="10">
     <w:abstractNumId w:val="19"/>
   </w:num>
-  <w:num w:numId="11" w16cid:durableId="344407676">
+  <w:num w:numId="11">
     <w:abstractNumId w:val="1"/>
   </w:num>
-  <w:num w:numId="12" w16cid:durableId="1331639966">
+  <w:num w:numId="12">
     <w:abstractNumId w:val="0"/>
   </w:num>
-  <w:num w:numId="13" w16cid:durableId="1720549370">
+  <w:num w:numId="13">
     <w:abstractNumId w:val="14"/>
   </w:num>
-  <w:num w:numId="14" w16cid:durableId="1690256414">
+  <w:num w:numId="14">
     <w:abstractNumId w:val="15"/>
   </w:num>
-  <w:num w:numId="15" w16cid:durableId="149374442">
+  <w:num w:numId="15">
     <w:abstractNumId w:val="16"/>
   </w:num>
-  <w:num w:numId="16" w16cid:durableId="2074815740">
+  <w:num w:numId="16">
     <w:abstractNumId w:val="20"/>
   </w:num>
-  <w:num w:numId="17" w16cid:durableId="99225367">
+  <w:num w:numId="17">
     <w:abstractNumId w:val="18"/>
   </w:num>
-  <w:num w:numId="18" w16cid:durableId="790706228">
+  <w:num w:numId="18">
     <w:abstractNumId w:val="17"/>
   </w:num>
-  <w:num w:numId="19" w16cid:durableId="1655066030">
+  <w:num w:numId="19">
     <w:abstractNumId w:val="7"/>
   </w:num>
-  <w:num w:numId="20" w16cid:durableId="2131632179">
+  <w:num w:numId="20">
     <w:abstractNumId w:val="6"/>
   </w:num>
-  <w:num w:numId="21" w16cid:durableId="1637299276">
+  <w:num w:numId="21">
     <w:abstractNumId w:val="21"/>
   </w:num>
-  <w:num w:numId="22" w16cid:durableId="1645160274">
+  <w:num w:numId="22">
     <w:abstractNumId w:val="5"/>
   </w:num>
 </w:numbering>
 </file>
 
 <file path=word/styles.xml><?xml version="1.0" encoding="utf-8"?>
-<w:styles xmlns:mc="http://schemas.openxmlformats.org/markup-compatibility/2006" xmlns:r="http://schemas.openxmlformats.org/officeDocument/2006/relationships" xmlns:w="http://schemas.openxmlformats.org/wordprocessingml/2006/main" xmlns:w14="http://schemas.microsoft.com/office/word/2010/wordml" xmlns:w15="http://schemas.microsoft.com/office/word/2012/wordml" xmlns:w16cex="http://schemas.microsoft.com/office/word/2018/wordml/cex" xmlns:w16cid="http://schemas.microsoft.com/office/word/2016/wordml/cid" xmlns:w16="http://schemas.microsoft.com/office/word/2018/wordml" xmlns:w16du="http://schemas.microsoft.com/office/word/2023/wordml/word16du" xmlns:w16sdtdh="http://schemas.microsoft.com/office/word/2020/wordml/sdtdatahash" xmlns:w16se="http://schemas.microsoft.com/office/word/2015/wordml/symex" mc:Ignorable="w14 w15 w16se w16cid w16 w16cex w16sdtdh w16du">
+<w:styles xmlns:mc="http://schemas.openxmlformats.org/markup-compatibility/2006" xmlns:r="http://schemas.openxmlformats.org/officeDocument/2006/relationships" xmlns:w="http://schemas.openxmlformats.org/wordprocessingml/2006/main" xmlns:w14="http://schemas.microsoft.com/office/word/2010/wordml" xmlns:w15="http://schemas.microsoft.com/office/word/2012/wordml" xmlns:w16cid="http://schemas.microsoft.com/office/word/2016/wordml/cid" xmlns:w16se="http://schemas.microsoft.com/office/word/2015/wordml/symex" mc:Ignorable="w14 w15 w16se w16cid">
   <w:docDefaults>
     <w:rPrDefault>
       <w:rPr>
@@ -9470,7 +9459,7 @@
       </w:pPr>
     </w:pPrDefault>
   </w:docDefaults>
-  <w:latentStyles w:defLockedState="0" w:defUIPriority="99" w:defSemiHidden="0" w:defUnhideWhenUsed="0" w:defQFormat="0" w:count="376">
+  <w:latentStyles w:defLockedState="0" w:defUIPriority="99" w:defSemiHidden="0" w:defUnhideWhenUsed="0" w:defQFormat="0" w:count="375">
     <w:lsdException w:name="Normal" w:uiPriority="0" w:qFormat="1"/>
     <w:lsdException w:name="heading 1" w:uiPriority="9" w:qFormat="1"/>
     <w:lsdException w:name="heading 2" w:semiHidden="1" w:uiPriority="9" w:unhideWhenUsed="1" w:qFormat="1"/>
@@ -9846,7 +9835,6 @@
     <w:lsdException w:name="Smart Hyperlink" w:semiHidden="1" w:unhideWhenUsed="1"/>
     <w:lsdException w:name="Hashtag" w:semiHidden="1" w:unhideWhenUsed="1"/>
     <w:lsdException w:name="Unresolved Mention" w:semiHidden="1" w:unhideWhenUsed="1"/>
-    <w:lsdException w:name="Smart Link" w:semiHidden="1" w:unhideWhenUsed="1"/>
   </w:latentStyles>
   <w:style w:type="paragraph" w:default="1" w:styleId="a">
     <w:name w:val="Normal"/>
@@ -10056,6 +10044,7 @@
   <w:style w:type="character" w:default="1" w:styleId="a0">
     <w:name w:val="Default Paragraph Font"/>
     <w:uiPriority w:val="1"/>
+    <w:semiHidden/>
     <w:unhideWhenUsed/>
   </w:style>
   <w:style w:type="table" w:default="1" w:styleId="a1">
@@ -10813,7 +10802,7 @@
 </file>
 
 <file path=customXml/itemProps1.xml><?xml version="1.0" encoding="utf-8"?>
-<ds:datastoreItem xmlns:ds="http://schemas.openxmlformats.org/officeDocument/2006/customXml" ds:itemID="{9B14BAE9-576E-4D07-A6D6-68772AA2335B}">
+<ds:datastoreItem xmlns:ds="http://schemas.openxmlformats.org/officeDocument/2006/customXml" ds:itemID="{D9240433-EF1B-4678-95D4-FA64777F095A}">
   <ds:schemaRefs>
     <ds:schemaRef ds:uri="http://schemas.openxmlformats.org/officeDocument/2006/bibliography"/>
   </ds:schemaRefs>

</xml_diff>